<commit_message>
fix: harden CSV parsing and clarify the exercises after an end-to-end run
Decode downloaded CSV files with utf-8-sig so a spreadsheet byte-order
mark no longer hides the first column, reject "1_000"-style cells, and
accept any sequence of values in the pipeline functions.

Clarify the docs from a full run of the exercises: the intentional
failing test, the Python version check, working on a branch, the
constant-column choice, the overflow edge case, and how the reviewer
finds the changed files. Align the Plan Mode wording in the lesson
document.
</commit_message>
<xml_diff>
--- a/docs/explore-plan-code-commit.docx
+++ b/docs/explore-plan-code-commit.docx
@@ -37,7 +37,7 @@
         </w:rPr>
         <w:sectPr>
           <w:pgSz w:h="15840" w:w="12240" w:orient="portrait"/>
-          <w:pgMar w:bottom="1440" w:top="1440" w:left="1440" w:right="1440" w:header="720" w:footer="720"/>
+          <w:pgMar w:bottom="1440" w:top="1440" w:left="1440" w:right="1440" w:header="720" w:footer="720" w:gutter="0"/>
           <w:pgNumType w:start="1"/>
         </w:sectPr>
       </w:pPr>
@@ -642,7 +642,7 @@
         <w:rPr>
           <w:rtl w:val="0"/>
         </w:rPr>
-        <w:t xml:space="preserve"> until you see “Plan Mode” under the text input. Then write a prompt like the one below.</w:t>
+        <w:t xml:space="preserve"> until the footer reads “plan mode on”. Then write a prompt like the one below.</w:t>
       </w:r>
     </w:p>
     <w:p>
@@ -2094,7 +2094,7 @@
           <w:footerReference r:id="rId13" w:type="first"/>
           <w:type w:val="nextPage"/>
           <w:pgSz w:h="15840" w:w="12240" w:orient="portrait"/>
-          <w:pgMar w:bottom="1440" w:top="1440" w:left="1440" w:right="1440" w:header="708" w:footer="708"/>
+          <w:pgMar w:bottom="1440" w:top="1440" w:left="1440" w:right="1440" w:header="708" w:footer="708" w:gutter="0"/>
           <w:pgNumType w:start="1"/>
           <w:titlePg w:val="1"/>
         </w:sectPr>
@@ -2131,7 +2131,7 @@
           <w:footerReference r:id="rId17" w:type="first"/>
           <w:type w:val="nextPage"/>
           <w:pgSz w:h="15840" w:w="12240" w:orient="portrait"/>
-          <w:pgMar w:bottom="1440" w:top="1440" w:left="1440" w:right="1440" w:header="720" w:footer="720"/>
+          <w:pgMar w:bottom="1440" w:top="1440" w:left="1440" w:right="1440" w:header="720" w:footer="720" w:gutter="0"/>
           <w:pgNumType w:start="1"/>
         </w:sectPr>
       </w:pPr>
@@ -5064,7 +5064,7 @@
       <w:footerReference r:id="rId22" w:type="first"/>
       <w:type w:val="nextPage"/>
       <w:pgSz w:h="15840" w:w="12240" w:orient="portrait"/>
-      <w:pgMar w:bottom="1440" w:top="1440" w:left="1440" w:right="1440" w:header="720" w:footer="720"/>
+      <w:pgMar w:bottom="1440" w:top="1440" w:left="1440" w:right="1440" w:header="720" w:footer="720" w:gutter="0"/>
       <w:pgNumType w:start="1"/>
     </w:sectPr>
   </w:body>

</xml_diff>